<commit_message>
Add genre/prenom to RQTH and FIPHFP, fix convocation date, misc UX improvements
- Add genre + prenom fields to Rqth and Fiphfp entities, forms, and templates
- Migrate existing agent names to separate nom/prenom columns via SQL
- Fix convocation PDF date: replace hardcoded date in DOCX with «DateJour» placeholder
- Add heure field to fiche de suivi prochaine visite section
- Remove convocation button from edit form (kept only in show page)
- Add Convocation button next to prochaine visite dates in show page
- Reduce table row padding and dl row spacing across the app

Co-Authored-By: Claude Sonnet 4.6 <noreply@anthropic.com>
</commit_message>
<xml_diff>
--- a/convocations/infirmier.docx
+++ b/convocations/infirmier.docx
@@ -746,7 +746,7 @@
           <w:sz w:val="20"/>
           <w:szCs w:val="20"/>
         </w:rPr>
-        <w:t>20 avril 2026</w:t>
+        <w:t>«DateJour»</w:t>
       </w:r>
     </w:p>
     <w:p>
@@ -811,7 +811,7 @@
           <w:sz w:val="20"/>
           <w:szCs w:val="20"/>
         </w:rPr>
-        <w:t>SC</w:t>
+        <w:t>DQ</w:t>
       </w:r>
       <w:r>
         <w:rPr>

</xml_diff>

<commit_message>
Update infirmier.docx and medecin.docx convocation templates
</commit_message>
<xml_diff>
--- a/convocations/infirmier.docx
+++ b/convocations/infirmier.docx
@@ -364,13 +364,13 @@
         <mc:AlternateContent>
           <mc:Choice Requires="wps">
             <w:drawing>
-              <wp:anchor distT="0" distB="0" distL="114300" distR="114300" simplePos="0" relativeHeight="251662336" behindDoc="0" locked="0" layoutInCell="1" allowOverlap="1" wp14:anchorId="5BA1BE5A" wp14:editId="0690007A">
+              <wp:anchor distT="0" distB="0" distL="114300" distR="114300" simplePos="0" relativeHeight="251662336" behindDoc="0" locked="0" layoutInCell="1" allowOverlap="1" wp14:anchorId="5BA1BE5A" wp14:editId="0D0BE1AF">
                 <wp:simplePos x="0" y="0"/>
                 <wp:positionH relativeFrom="column">
                   <wp:posOffset>691515</wp:posOffset>
                 </wp:positionH>
                 <wp:positionV relativeFrom="paragraph">
-                  <wp:posOffset>276225</wp:posOffset>
+                  <wp:posOffset>247650</wp:posOffset>
                 </wp:positionV>
                 <wp:extent cx="736600" cy="0"/>
                 <wp:effectExtent l="12700" t="9525" r="12700" b="9525"/>
@@ -425,11 +425,11 @@
           </mc:Choice>
           <mc:Fallback>
             <w:pict>
-              <v:shapetype w14:anchorId="2799B430" id="_x0000_t32" coordsize="21600,21600" o:spt="32" o:oned="t" path="m,l21600,21600e" filled="f">
+              <v:shapetype w14:anchorId="72DE2C91" id="_x0000_t32" coordsize="21600,21600" o:spt="32" o:oned="t" path="m,l21600,21600e" filled="f">
                 <v:path arrowok="t" fillok="f" o:connecttype="none"/>
                 <o:lock v:ext="edit" shapetype="t"/>
               </v:shapetype>
-              <v:shape id="AutoShape 7" o:spid="_x0000_s1026" type="#_x0000_t32" style="position:absolute;margin-left:54.45pt;margin-top:21.75pt;width:58pt;height:0;z-index:251662336;visibility:visible;mso-wrap-style:square;mso-width-percent:0;mso-height-percent:0;mso-wrap-distance-left:9pt;mso-wrap-distance-top:0;mso-wrap-distance-right:9pt;mso-wrap-distance-bottom:0;mso-position-horizontal:absolute;mso-position-horizontal-relative:text;mso-position-vertical:absolute;mso-position-vertical-relative:text;mso-width-percent:0;mso-height-percent:0;mso-width-relative:page;mso-height-relative:page" o:gfxdata="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"/>
+              <v:shape id="AutoShape 7" o:spid="_x0000_s1026" type="#_x0000_t32" style="position:absolute;margin-left:54.45pt;margin-top:19.5pt;width:58pt;height:0;z-index:251662336;visibility:visible;mso-wrap-style:square;mso-width-percent:0;mso-height-percent:0;mso-wrap-distance-left:9pt;mso-wrap-distance-top:0;mso-wrap-distance-right:9pt;mso-wrap-distance-bottom:0;mso-position-horizontal:absolute;mso-position-horizontal-relative:text;mso-position-vertical:absolute;mso-position-vertical-relative:text;mso-width-percent:0;mso-height-percent:0;mso-width-relative:page;mso-height-relative:page" o:gfxdata="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"/>
             </w:pict>
           </mc:Fallback>
         </mc:AlternateContent>
@@ -453,13 +453,13 @@
         <mc:AlternateContent>
           <mc:Choice Requires="wps">
             <w:drawing>
-              <wp:anchor distT="0" distB="0" distL="114300" distR="114300" simplePos="0" relativeHeight="251663360" behindDoc="0" locked="0" layoutInCell="1" allowOverlap="1" wp14:anchorId="67106958" wp14:editId="74B8E098">
+              <wp:anchor distT="0" distB="0" distL="114300" distR="114300" simplePos="0" relativeHeight="251663360" behindDoc="0" locked="0" layoutInCell="1" allowOverlap="1" wp14:anchorId="67106958" wp14:editId="0C7B43F2">
                 <wp:simplePos x="0" y="0"/>
                 <wp:positionH relativeFrom="column">
                   <wp:posOffset>685165</wp:posOffset>
                 </wp:positionH>
                 <wp:positionV relativeFrom="paragraph">
-                  <wp:posOffset>283210</wp:posOffset>
+                  <wp:posOffset>226060</wp:posOffset>
                 </wp:positionV>
                 <wp:extent cx="742950" cy="0"/>
                 <wp:effectExtent l="6350" t="6350" r="12700" b="12700"/>
@@ -514,7 +514,7 @@
           </mc:Choice>
           <mc:Fallback>
             <w:pict>
-              <v:shape w14:anchorId="0D96984F" id="AutoShape 8" o:spid="_x0000_s1026" type="#_x0000_t32" style="position:absolute;margin-left:53.95pt;margin-top:22.3pt;width:58.5pt;height:0;z-index:251663360;visibility:visible;mso-wrap-style:square;mso-width-percent:0;mso-height-percent:0;mso-wrap-distance-left:9pt;mso-wrap-distance-top:0;mso-wrap-distance-right:9pt;mso-wrap-distance-bottom:0;mso-position-horizontal:absolute;mso-position-horizontal-relative:text;mso-position-vertical:absolute;mso-position-vertical-relative:text;mso-width-percent:0;mso-height-percent:0;mso-width-relative:page;mso-height-relative:page" o:gfxdata="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"/>
+              <v:shape w14:anchorId="614E82E9" id="AutoShape 8" o:spid="_x0000_s1026" type="#_x0000_t32" style="position:absolute;margin-left:53.95pt;margin-top:17.8pt;width:58.5pt;height:0;z-index:251663360;visibility:visible;mso-wrap-style:square;mso-width-percent:0;mso-height-percent:0;mso-wrap-distance-left:9pt;mso-wrap-distance-top:0;mso-wrap-distance-right:9pt;mso-wrap-distance-bottom:0;mso-position-horizontal:absolute;mso-position-horizontal-relative:text;mso-position-vertical:absolute;mso-position-vertical-relative:text;mso-width-percent:0;mso-height-percent:0;mso-width-relative:page;mso-height-relative:page" o:gfxdata="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"/>
             </w:pict>
           </mc:Fallback>
         </mc:AlternateContent>
@@ -732,6 +732,7 @@
         </w:rPr>
         <w:t>, le</w:t>
       </w:r>
+      <w:proofErr w:type="gramStart"/>
       <w:r>
         <w:rPr>
           <w:rFonts w:ascii="Montserrat" w:hAnsi="Montserrat"/>
@@ -746,7 +747,26 @@
           <w:sz w:val="20"/>
           <w:szCs w:val="20"/>
         </w:rPr>
-        <w:t>«DateJour»</w:t>
+        <w:t>«</w:t>
+      </w:r>
+      <w:proofErr w:type="spellStart"/>
+      <w:r>
+        <w:rPr>
+          <w:rFonts w:ascii="Montserrat" w:hAnsi="Montserrat"/>
+          <w:sz w:val="20"/>
+          <w:szCs w:val="20"/>
+        </w:rPr>
+        <w:t>DateJour</w:t>
+      </w:r>
+      <w:proofErr w:type="spellEnd"/>
+      <w:proofErr w:type="gramEnd"/>
+      <w:r>
+        <w:rPr>
+          <w:rFonts w:ascii="Montserrat" w:hAnsi="Montserrat"/>
+          <w:sz w:val="20"/>
+          <w:szCs w:val="20"/>
+        </w:rPr>
+        <w:t>»</w:t>
       </w:r>
     </w:p>
     <w:p>

</xml_diff>